<commit_message>
Fix collisioni nemico > muro
</commit_message>
<xml_diff>
--- a/4_Diario/Diario8.docx
+++ b/4_Diario/Diario8.docx
@@ -121,7 +121,7 @@
               <w:rPr>
                 <w:rFonts w:ascii="Arial" w:hAnsi="Arial" w:cs="Arial"/>
               </w:rPr>
-              <w:t>20</w:t>
+              <w:t>17</w:t>
             </w:r>
             <w:r>
               <w:rPr>
@@ -133,7 +133,7 @@
               <w:rPr>
                 <w:rFonts w:ascii="Arial" w:hAnsi="Arial" w:cs="Arial"/>
               </w:rPr>
-              <w:t>3</w:t>
+              <w:t>4</w:t>
             </w:r>
             <w:r>
               <w:rPr>
@@ -217,7 +217,7 @@
               <w:rPr>
                 <w:rFonts w:ascii="Arial" w:hAnsi="Arial" w:cs="Arial"/>
               </w:rPr>
-              <w:t>1</w:t>
+              <w:t>0</w:t>
             </w:r>
             <w:r>
               <w:rPr>
@@ -229,7 +229,7 @@
               <w:rPr>
                 <w:rFonts w:ascii="Arial" w:hAnsi="Arial" w:cs="Arial"/>
               </w:rPr>
-              <w:t>5</w:t>
+              <w:t>0</w:t>
             </w:r>
           </w:p>
         </w:tc>
@@ -247,7 +247,7 @@
               <w:rPr>
                 <w:rFonts w:ascii="Arial" w:hAnsi="Arial" w:cs="Arial"/>
               </w:rPr>
-              <w:t>Generazione delle stanze</w:t>
+              <w:t>Verifica</w:t>
             </w:r>
           </w:p>
         </w:tc>
@@ -270,37 +270,7 @@
               <w:rPr>
                 <w:rFonts w:ascii="Arial" w:hAnsi="Arial" w:cs="Arial"/>
               </w:rPr>
-              <w:t>1</w:t>
-            </w:r>
-            <w:r>
-              <w:rPr>
-                <w:rFonts w:ascii="Arial" w:hAnsi="Arial" w:cs="Arial"/>
-              </w:rPr>
-              <w:t>2:30</w:t>
-            </w:r>
-            <w:r>
-              <w:rPr>
-                <w:rFonts w:ascii="Arial" w:hAnsi="Arial" w:cs="Arial"/>
-              </w:rPr>
-              <w:t xml:space="preserve"> – 1</w:t>
-            </w:r>
-            <w:r>
-              <w:rPr>
-                <w:rFonts w:ascii="Arial" w:hAnsi="Arial" w:cs="Arial"/>
-              </w:rPr>
-              <w:t>5</w:t>
-            </w:r>
-            <w:r>
-              <w:rPr>
-                <w:rFonts w:ascii="Arial" w:hAnsi="Arial" w:cs="Arial"/>
-              </w:rPr>
-              <w:t>:</w:t>
-            </w:r>
-            <w:r>
-              <w:rPr>
-                <w:rFonts w:ascii="Arial" w:hAnsi="Arial" w:cs="Arial"/>
-              </w:rPr>
-              <w:t>45</w:t>
+              <w:t>10:30 – 11:35</w:t>
             </w:r>
           </w:p>
         </w:tc>
@@ -318,7 +288,48 @@
               <w:rPr>
                 <w:rFonts w:ascii="Arial" w:hAnsi="Arial" w:cs="Arial"/>
               </w:rPr>
-              <w:t xml:space="preserve">Sistema di chiusura delle porte </w:t>
+              <w:t xml:space="preserve"> Ricerca sull’AI Steering che permette all’AI di evitare gli ostacoli in maniera intelligente evitando di sbatterci continuamente addosso</w:t>
+            </w:r>
+          </w:p>
+        </w:tc>
+      </w:tr>
+      <w:tr>
+        <w:trPr>
+          <w:trHeight w:val="634"/>
+        </w:trPr>
+        <w:tc>
+          <w:tcPr>
+            <w:tcW w:w="1696" w:type="dxa"/>
+          </w:tcPr>
+          <w:p>
+            <w:pPr>
+              <w:rPr>
+                <w:rFonts w:ascii="Arial" w:hAnsi="Arial" w:cs="Arial"/>
+              </w:rPr>
+            </w:pPr>
+            <w:r>
+              <w:rPr>
+                <w:rFonts w:ascii="Arial" w:hAnsi="Arial" w:cs="Arial"/>
+              </w:rPr>
+              <w:t>12:30 – 15:45</w:t>
+            </w:r>
+          </w:p>
+        </w:tc>
+        <w:tc>
+          <w:tcPr>
+            <w:tcW w:w="7932" w:type="dxa"/>
+          </w:tcPr>
+          <w:p>
+            <w:pPr>
+              <w:rPr>
+                <w:rFonts w:ascii="Arial" w:hAnsi="Arial" w:cs="Arial"/>
+              </w:rPr>
+            </w:pPr>
+            <w:r>
+              <w:rPr>
+                <w:rFonts w:ascii="Arial" w:hAnsi="Arial" w:cs="Arial"/>
+              </w:rPr>
+              <w:t>Implementazione dell’AI Steering</w:t>
             </w:r>
           </w:p>
         </w:tc>
@@ -404,7 +415,7 @@
       <w:tr>
         <w:tc>
           <w:tcPr>
-            <w:tcW w:w="9854" w:type="dxa"/>
+            <w:tcW w:w="9628" w:type="dxa"/>
             <w:shd w:val="clear" w:color="auto" w:fill="D9D9D9" w:themeFill="background1" w:themeFillShade="D9"/>
           </w:tcPr>
           <w:p>
@@ -425,19 +436,19 @@
       <w:tr>
         <w:tc>
           <w:tcPr>
-            <w:tcW w:w="9854" w:type="dxa"/>
-          </w:tcPr>
-          <w:p>
-            <w:pPr>
-              <w:rPr>
-                <w:rFonts w:ascii="Arial" w:hAnsi="Arial" w:cs="Arial"/>
-              </w:rPr>
-            </w:pPr>
-            <w:r>
-              <w:rPr>
-                <w:rFonts w:ascii="Arial" w:hAnsi="Arial" w:cs="Arial"/>
-              </w:rPr>
-              <w:t>N/D</w:t>
+            <w:tcW w:w="9628" w:type="dxa"/>
+          </w:tcPr>
+          <w:p>
+            <w:pPr>
+              <w:rPr>
+                <w:rFonts w:ascii="Arial" w:hAnsi="Arial" w:cs="Arial"/>
+              </w:rPr>
+            </w:pPr>
+            <w:r>
+              <w:rPr>
+                <w:rFonts w:ascii="Arial" w:hAnsi="Arial" w:cs="Arial"/>
+              </w:rPr>
+              <w:t>Coerente rispetto alla pianificazione</w:t>
             </w:r>
           </w:p>
         </w:tc>
@@ -545,14 +556,7 @@
           <w:rFonts w:ascii="Arial" w:hAnsi="Arial" w:cs="Arial"/>
           <w:color w:val="auto"/>
         </w:rPr>
-        <w:t xml:space="preserve"> </w:t>
-      </w:r>
-      <w:r>
-        <w:rPr>
-          <w:rFonts w:ascii="Arial" w:hAnsi="Arial" w:cs="Arial"/>
-          <w:color w:val="auto"/>
-        </w:rPr>
-        <w:t>Armir</w:t>
+        <w:t xml:space="preserve"> Armir</w:t>
       </w:r>
     </w:p>
     <w:tbl>
@@ -648,7 +652,7 @@
               <w:rPr>
                 <w:rFonts w:ascii="Arial" w:hAnsi="Arial" w:cs="Arial"/>
               </w:rPr>
-              <w:t>20.03.2026</w:t>
+              <w:t>17.04.2026</w:t>
             </w:r>
           </w:p>
         </w:tc>
@@ -711,7 +715,7 @@
               <w:rPr>
                 <w:rFonts w:ascii="Arial" w:hAnsi="Arial" w:cs="Arial"/>
               </w:rPr>
-              <w:t>08:20 – 10:50</w:t>
+              <w:t>08:20 – 10:30</w:t>
             </w:r>
           </w:p>
         </w:tc>
@@ -729,7 +733,7 @@
               <w:rPr>
                 <w:rFonts w:ascii="Arial" w:hAnsi="Arial" w:cs="Arial"/>
               </w:rPr>
-              <w:t>Sistema di danni dal player al nemico</w:t>
+              <w:t>Verifica</w:t>
             </w:r>
           </w:p>
         </w:tc>
@@ -749,7 +753,43 @@
               <w:rPr>
                 <w:rFonts w:ascii="Arial" w:hAnsi="Arial" w:cs="Arial"/>
               </w:rPr>
-              <w:t>10:05 – 13:15</w:t>
+              <w:t>10:</w:t>
+            </w:r>
+            <w:r>
+              <w:rPr>
+                <w:rFonts w:ascii="Arial" w:hAnsi="Arial" w:cs="Arial"/>
+              </w:rPr>
+              <w:t>30</w:t>
+            </w:r>
+            <w:r>
+              <w:rPr>
+                <w:rFonts w:ascii="Arial" w:hAnsi="Arial" w:cs="Arial"/>
+              </w:rPr>
+              <w:t xml:space="preserve"> – 1</w:t>
+            </w:r>
+            <w:r>
+              <w:rPr>
+                <w:rFonts w:ascii="Arial" w:hAnsi="Arial" w:cs="Arial"/>
+              </w:rPr>
+              <w:t>1</w:t>
+            </w:r>
+            <w:r>
+              <w:rPr>
+                <w:rFonts w:ascii="Arial" w:hAnsi="Arial" w:cs="Arial"/>
+              </w:rPr>
+              <w:t>:</w:t>
+            </w:r>
+            <w:r>
+              <w:rPr>
+                <w:rFonts w:ascii="Arial" w:hAnsi="Arial" w:cs="Arial"/>
+              </w:rPr>
+              <w:t>3</w:t>
+            </w:r>
+            <w:r>
+              <w:rPr>
+                <w:rFonts w:ascii="Arial" w:hAnsi="Arial" w:cs="Arial"/>
+              </w:rPr>
+              <w:t>5</w:t>
             </w:r>
           </w:p>
         </w:tc>
@@ -767,7 +807,7 @@
               <w:rPr>
                 <w:rFonts w:ascii="Arial" w:hAnsi="Arial" w:cs="Arial"/>
               </w:rPr>
-              <w:t>Sistema della vita del nemico</w:t>
+              <w:t>Pensare ad un design per l’animazione di morte del nemico.</w:t>
             </w:r>
           </w:p>
           <w:p>
@@ -794,7 +834,49 @@
               <w:rPr>
                 <w:rFonts w:ascii="Arial" w:hAnsi="Arial" w:cs="Arial"/>
               </w:rPr>
-              <w:t>13:15 – 15:45</w:t>
+              <w:t>1</w:t>
+            </w:r>
+            <w:r>
+              <w:rPr>
+                <w:rFonts w:ascii="Arial" w:hAnsi="Arial" w:cs="Arial"/>
+              </w:rPr>
+              <w:t>2</w:t>
+            </w:r>
+            <w:r>
+              <w:rPr>
+                <w:rFonts w:ascii="Arial" w:hAnsi="Arial" w:cs="Arial"/>
+              </w:rPr>
+              <w:t>:</w:t>
+            </w:r>
+            <w:r>
+              <w:rPr>
+                <w:rFonts w:ascii="Arial" w:hAnsi="Arial" w:cs="Arial"/>
+              </w:rPr>
+              <w:t>30</w:t>
+            </w:r>
+            <w:r>
+              <w:rPr>
+                <w:rFonts w:ascii="Arial" w:hAnsi="Arial" w:cs="Arial"/>
+              </w:rPr>
+              <w:t xml:space="preserve"> – 1</w:t>
+            </w:r>
+            <w:r>
+              <w:rPr>
+                <w:rFonts w:ascii="Arial" w:hAnsi="Arial" w:cs="Arial"/>
+              </w:rPr>
+              <w:t>4</w:t>
+            </w:r>
+            <w:r>
+              <w:rPr>
+                <w:rFonts w:ascii="Arial" w:hAnsi="Arial" w:cs="Arial"/>
+              </w:rPr>
+              <w:t>:</w:t>
+            </w:r>
+            <w:r>
+              <w:rPr>
+                <w:rFonts w:ascii="Arial" w:hAnsi="Arial" w:cs="Arial"/>
+              </w:rPr>
+              <w:t>15</w:t>
             </w:r>
           </w:p>
         </w:tc>
@@ -812,7 +894,45 @@
               <w:rPr>
                 <w:rFonts w:ascii="Arial" w:hAnsi="Arial" w:cs="Arial"/>
               </w:rPr>
-              <w:t>Sistema di trasformazione Flesh/Steel</w:t>
+              <w:t>Creazione dell’animazione di morte del nemico</w:t>
+            </w:r>
+          </w:p>
+        </w:tc>
+      </w:tr>
+      <w:tr>
+        <w:tc>
+          <w:tcPr>
+            <w:tcW w:w="1696" w:type="dxa"/>
+          </w:tcPr>
+          <w:p>
+            <w:pPr>
+              <w:rPr>
+                <w:rFonts w:ascii="Arial" w:hAnsi="Arial" w:cs="Arial"/>
+              </w:rPr>
+            </w:pPr>
+            <w:r>
+              <w:rPr>
+                <w:rFonts w:ascii="Arial" w:hAnsi="Arial" w:cs="Arial"/>
+              </w:rPr>
+              <w:t>14:15 – 15:45</w:t>
+            </w:r>
+          </w:p>
+        </w:tc>
+        <w:tc>
+          <w:tcPr>
+            <w:tcW w:w="7932" w:type="dxa"/>
+          </w:tcPr>
+          <w:p>
+            <w:pPr>
+              <w:rPr>
+                <w:rFonts w:ascii="Arial" w:hAnsi="Arial" w:cs="Arial"/>
+              </w:rPr>
+            </w:pPr>
+            <w:r>
+              <w:rPr>
+                <w:rFonts w:ascii="Arial" w:hAnsi="Arial" w:cs="Arial"/>
+              </w:rPr>
+              <w:t>Fare in modo che i nemici pulsino rosso quando vengono colpiti</w:t>
             </w:r>
           </w:p>
         </w:tc>
@@ -895,7 +1015,7 @@
       <w:tr>
         <w:tc>
           <w:tcPr>
-            <w:tcW w:w="9854" w:type="dxa"/>
+            <w:tcW w:w="9628" w:type="dxa"/>
             <w:shd w:val="clear" w:color="auto" w:fill="D9D9D9" w:themeFill="background1" w:themeFillShade="D9"/>
           </w:tcPr>
           <w:p>
@@ -916,19 +1036,19 @@
       <w:tr>
         <w:tc>
           <w:tcPr>
-            <w:tcW w:w="9854" w:type="dxa"/>
-          </w:tcPr>
-          <w:p>
-            <w:pPr>
-              <w:rPr>
-                <w:rFonts w:ascii="Arial" w:hAnsi="Arial" w:cs="Arial"/>
-              </w:rPr>
-            </w:pPr>
-            <w:r>
-              <w:rPr>
-                <w:rFonts w:ascii="Arial" w:hAnsi="Arial" w:cs="Arial"/>
-              </w:rPr>
-              <w:t>N/D</w:t>
+            <w:tcW w:w="9628" w:type="dxa"/>
+          </w:tcPr>
+          <w:p>
+            <w:pPr>
+              <w:rPr>
+                <w:rFonts w:ascii="Arial" w:hAnsi="Arial" w:cs="Arial"/>
+              </w:rPr>
+            </w:pPr>
+            <w:r>
+              <w:rPr>
+                <w:rFonts w:ascii="Arial" w:hAnsi="Arial" w:cs="Arial"/>
+              </w:rPr>
+              <w:t>Coerente rispetto alla pianificazione</w:t>
             </w:r>
           </w:p>
         </w:tc>
@@ -1132,7 +1252,7 @@
               <w:rPr>
                 <w:rFonts w:ascii="Arial" w:hAnsi="Arial" w:cs="Arial"/>
               </w:rPr>
-              <w:t>20.03.2026</w:t>
+              <w:t>17.04.2026</w:t>
             </w:r>
           </w:p>
         </w:tc>
@@ -1195,13 +1315,7 @@
               <w:rPr>
                 <w:rFonts w:ascii="Arial" w:hAnsi="Arial" w:cs="Arial"/>
               </w:rPr>
-              <w:t xml:space="preserve">08:20 – </w:t>
-            </w:r>
-            <w:r>
-              <w:rPr>
-                <w:rFonts w:ascii="Arial" w:hAnsi="Arial" w:cs="Arial"/>
-              </w:rPr>
-              <w:t>11:35</w:t>
+              <w:t>08:20 – 10:30</w:t>
             </w:r>
           </w:p>
         </w:tc>
@@ -1219,7 +1333,7 @@
               <w:rPr>
                 <w:rFonts w:ascii="Arial" w:hAnsi="Arial" w:cs="Arial"/>
               </w:rPr>
-              <w:t>Documentato su un ai per il nemico, per renderlo piu intelligente e dinamico in modo che riesca ad evitare gli ostacoli e dirigersi piu velocemente verso il player</w:t>
+              <w:t>Verifica</w:t>
             </w:r>
           </w:p>
         </w:tc>
@@ -1239,7 +1353,19 @@
               <w:rPr>
                 <w:rFonts w:ascii="Arial" w:hAnsi="Arial" w:cs="Arial"/>
               </w:rPr>
-              <w:t>12:</w:t>
+              <w:t>1</w:t>
+            </w:r>
+            <w:r>
+              <w:rPr>
+                <w:rFonts w:ascii="Arial" w:hAnsi="Arial" w:cs="Arial"/>
+              </w:rPr>
+              <w:t>0</w:t>
+            </w:r>
+            <w:r>
+              <w:rPr>
+                <w:rFonts w:ascii="Arial" w:hAnsi="Arial" w:cs="Arial"/>
+              </w:rPr>
+              <w:t>:</w:t>
             </w:r>
             <w:r>
               <w:rPr>
@@ -1257,13 +1383,19 @@
               <w:rPr>
                 <w:rFonts w:ascii="Arial" w:hAnsi="Arial" w:cs="Arial"/>
               </w:rPr>
-              <w:t>5</w:t>
-            </w:r>
-            <w:r>
-              <w:rPr>
-                <w:rFonts w:ascii="Arial" w:hAnsi="Arial" w:cs="Arial"/>
-              </w:rPr>
-              <w:t>:00</w:t>
+              <w:t>1</w:t>
+            </w:r>
+            <w:r>
+              <w:rPr>
+                <w:rFonts w:ascii="Arial" w:hAnsi="Arial" w:cs="Arial"/>
+              </w:rPr>
+              <w:t>:</w:t>
+            </w:r>
+            <w:r>
+              <w:rPr>
+                <w:rFonts w:ascii="Arial" w:hAnsi="Arial" w:cs="Arial"/>
+              </w:rPr>
+              <w:t>35</w:t>
             </w:r>
           </w:p>
         </w:tc>
@@ -1281,7 +1413,31 @@
               <w:rPr>
                 <w:rFonts w:ascii="Arial" w:hAnsi="Arial" w:cs="Arial"/>
               </w:rPr>
-              <w:t>Implementazione della documentazione svolta durante la mattinata</w:t>
+              <w:t xml:space="preserve">Pensare ad un design per l’animazione di morte del </w:t>
+            </w:r>
+            <w:r>
+              <w:rPr>
+                <w:rFonts w:ascii="Arial" w:hAnsi="Arial" w:cs="Arial"/>
+              </w:rPr>
+              <w:t xml:space="preserve">secondo </w:t>
+            </w:r>
+            <w:r>
+              <w:rPr>
+                <w:rFonts w:ascii="Arial" w:hAnsi="Arial" w:cs="Arial"/>
+              </w:rPr>
+              <w:t>n</w:t>
+            </w:r>
+            <w:r>
+              <w:rPr>
+                <w:rFonts w:ascii="Arial" w:hAnsi="Arial" w:cs="Arial"/>
+              </w:rPr>
+              <w:t>e</w:t>
+            </w:r>
+            <w:r>
+              <w:rPr>
+                <w:rFonts w:ascii="Arial" w:hAnsi="Arial" w:cs="Arial"/>
+              </w:rPr>
+              <w:t>mico.</w:t>
             </w:r>
           </w:p>
         </w:tc>
@@ -1307,7 +1463,13 @@
               <w:rPr>
                 <w:rFonts w:ascii="Arial" w:hAnsi="Arial" w:cs="Arial"/>
               </w:rPr>
-              <w:t>5:00</w:t>
+              <w:t>2:3</w:t>
+            </w:r>
+            <w:r>
+              <w:rPr>
+                <w:rFonts w:ascii="Arial" w:hAnsi="Arial" w:cs="Arial"/>
+              </w:rPr>
+              <w:t>0</w:t>
             </w:r>
             <w:r>
               <w:rPr>
@@ -1319,7 +1481,13 @@
               <w:rPr>
                 <w:rFonts w:ascii="Arial" w:hAnsi="Arial" w:cs="Arial"/>
               </w:rPr>
-              <w:t>15:45</w:t>
+              <w:t>1</w:t>
+            </w:r>
+            <w:r>
+              <w:rPr>
+                <w:rFonts w:ascii="Arial" w:hAnsi="Arial" w:cs="Arial"/>
+              </w:rPr>
+              <w:t>4:00</w:t>
             </w:r>
           </w:p>
         </w:tc>
@@ -1337,7 +1505,45 @@
               <w:rPr>
                 <w:rFonts w:ascii="Arial" w:hAnsi="Arial" w:cs="Arial"/>
               </w:rPr>
-              <w:t>Scritto il diario di lavoro con il mio caro compagno Nicolas</w:t>
+              <w:t>Creazione della animazione di morte del secondo nemico.</w:t>
+            </w:r>
+          </w:p>
+        </w:tc>
+      </w:tr>
+      <w:tr>
+        <w:tc>
+          <w:tcPr>
+            <w:tcW w:w="1696" w:type="dxa"/>
+          </w:tcPr>
+          <w:p>
+            <w:pPr>
+              <w:rPr>
+                <w:rFonts w:ascii="Arial" w:hAnsi="Arial" w:cs="Arial"/>
+              </w:rPr>
+            </w:pPr>
+            <w:r>
+              <w:rPr>
+                <w:rFonts w:ascii="Arial" w:hAnsi="Arial" w:cs="Arial"/>
+              </w:rPr>
+              <w:t>14:00 – 15:45</w:t>
+            </w:r>
+          </w:p>
+        </w:tc>
+        <w:tc>
+          <w:tcPr>
+            <w:tcW w:w="7932" w:type="dxa"/>
+          </w:tcPr>
+          <w:p>
+            <w:pPr>
+              <w:rPr>
+                <w:rFonts w:ascii="Arial" w:hAnsi="Arial" w:cs="Arial"/>
+              </w:rPr>
+            </w:pPr>
+            <w:r>
+              <w:rPr>
+                <w:rFonts w:ascii="Arial" w:hAnsi="Arial" w:cs="Arial"/>
+              </w:rPr>
+              <w:t>Implementazione delle animazioni di morte dei nemici nel gioco.</w:t>
             </w:r>
           </w:p>
         </w:tc>
@@ -1658,7 +1864,7 @@
               <w:rPr>
                 <w:rFonts w:ascii="Arial" w:hAnsi="Arial" w:cs="Arial"/>
               </w:rPr>
-              <w:t>20.03.2026</w:t>
+              <w:t>17.04.2026</w:t>
             </w:r>
           </w:p>
         </w:tc>
@@ -1721,19 +1927,7 @@
               <w:rPr>
                 <w:rFonts w:ascii="Arial" w:hAnsi="Arial" w:cs="Arial"/>
               </w:rPr>
-              <w:t xml:space="preserve">08:20 – </w:t>
-            </w:r>
-            <w:r>
-              <w:rPr>
-                <w:rFonts w:ascii="Arial" w:hAnsi="Arial" w:cs="Arial"/>
-              </w:rPr>
-              <w:t>10</w:t>
-            </w:r>
-            <w:r>
-              <w:rPr>
-                <w:rFonts w:ascii="Arial" w:hAnsi="Arial" w:cs="Arial"/>
-              </w:rPr>
-              <w:t>:50</w:t>
+              <w:t>08:20 – 10:30</w:t>
             </w:r>
           </w:p>
         </w:tc>
@@ -1751,15 +1945,8 @@
               <w:rPr>
                 <w:rFonts w:ascii="Arial" w:hAnsi="Arial" w:cs="Arial"/>
               </w:rPr>
-              <w:t>Sprite stanza del boss</w:t>
-            </w:r>
-          </w:p>
-          <w:p>
-            <w:pPr>
-              <w:rPr>
-                <w:rFonts w:ascii="Arial" w:hAnsi="Arial" w:cs="Arial"/>
-              </w:rPr>
-            </w:pPr>
+              <w:t>Verifica</w:t>
+            </w:r>
           </w:p>
         </w:tc>
       </w:tr>
@@ -1778,13 +1965,25 @@
               <w:rPr>
                 <w:rFonts w:ascii="Arial" w:hAnsi="Arial" w:cs="Arial"/>
               </w:rPr>
-              <w:t>10:05 – 1</w:t>
-            </w:r>
-            <w:r>
-              <w:rPr>
-                <w:rFonts w:ascii="Arial" w:hAnsi="Arial" w:cs="Arial"/>
-              </w:rPr>
-              <w:t>2</w:t>
+              <w:t>10:</w:t>
+            </w:r>
+            <w:r>
+              <w:rPr>
+                <w:rFonts w:ascii="Arial" w:hAnsi="Arial" w:cs="Arial"/>
+              </w:rPr>
+              <w:t>30</w:t>
+            </w:r>
+            <w:r>
+              <w:rPr>
+                <w:rFonts w:ascii="Arial" w:hAnsi="Arial" w:cs="Arial"/>
+              </w:rPr>
+              <w:t xml:space="preserve"> – 1</w:t>
+            </w:r>
+            <w:r>
+              <w:rPr>
+                <w:rFonts w:ascii="Arial" w:hAnsi="Arial" w:cs="Arial"/>
+              </w:rPr>
+              <w:t>1</w:t>
             </w:r>
             <w:r>
               <w:rPr>
@@ -1796,7 +1995,7 @@
               <w:rPr>
                 <w:rFonts w:ascii="Arial" w:hAnsi="Arial" w:cs="Arial"/>
               </w:rPr>
-              <w:t>30</w:t>
+              <w:t>35</w:t>
             </w:r>
           </w:p>
         </w:tc>
@@ -1814,7 +2013,7 @@
               <w:rPr>
                 <w:rFonts w:ascii="Arial" w:hAnsi="Arial" w:cs="Arial"/>
               </w:rPr>
-              <w:t>Sprite stanze bloccate</w:t>
+              <w:t>Creazione delle User Story</w:t>
             </w:r>
           </w:p>
         </w:tc>
@@ -1834,13 +2033,63 @@
               <w:rPr>
                 <w:rFonts w:ascii="Arial" w:hAnsi="Arial" w:cs="Arial"/>
               </w:rPr>
+              <w:t>12:30 – 15:00</w:t>
+            </w:r>
+          </w:p>
+        </w:tc>
+        <w:tc>
+          <w:tcPr>
+            <w:tcW w:w="7932" w:type="dxa"/>
+          </w:tcPr>
+          <w:p>
+            <w:pPr>
+              <w:rPr>
+                <w:rFonts w:ascii="Arial" w:hAnsi="Arial" w:cs="Arial"/>
+              </w:rPr>
+            </w:pPr>
+            <w:r>
+              <w:rPr>
+                <w:rFonts w:ascii="Arial" w:hAnsi="Arial" w:cs="Arial"/>
+              </w:rPr>
+              <w:t>Sistemato il sistema di stamina e migliorato il design delle stanze.</w:t>
+            </w:r>
+          </w:p>
+        </w:tc>
+      </w:tr>
+      <w:tr>
+        <w:tc>
+          <w:tcPr>
+            <w:tcW w:w="1696" w:type="dxa"/>
+          </w:tcPr>
+          <w:p>
+            <w:pPr>
+              <w:rPr>
+                <w:rFonts w:ascii="Arial" w:hAnsi="Arial" w:cs="Arial"/>
+              </w:rPr>
+            </w:pPr>
+            <w:r>
+              <w:rPr>
+                <w:rFonts w:ascii="Arial" w:hAnsi="Arial" w:cs="Arial"/>
+              </w:rPr>
               <w:t>1</w:t>
             </w:r>
             <w:r>
               <w:rPr>
                 <w:rFonts w:ascii="Arial" w:hAnsi="Arial" w:cs="Arial"/>
               </w:rPr>
-              <w:t>3:15</w:t>
+              <w:t>5</w:t>
+            </w:r>
+            <w:r>
+              <w:rPr>
+                <w:rFonts w:ascii="Arial" w:hAnsi="Arial" w:cs="Arial"/>
+              </w:rPr>
+              <w:t>:</w:t>
+            </w:r>
+            <w:r>
+              <w:rPr>
+                <w:rFonts w:ascii="Arial" w:hAnsi="Arial" w:cs="Arial"/>
+              </w:rPr>
+              <w:t>00</w:t>
             </w:r>
             <w:r>
               <w:rPr>
@@ -1882,7 +2131,7 @@
               <w:rPr>
                 <w:rFonts w:ascii="Arial" w:hAnsi="Arial" w:cs="Arial"/>
               </w:rPr>
-              <w:t>Sprite del nemico secondario</w:t>
+              <w:t>Continuazione della documentazione</w:t>
             </w:r>
           </w:p>
         </w:tc>
@@ -2198,7 +2447,7 @@
               <w:rPr>
                 <w:rFonts w:ascii="Arial" w:hAnsi="Arial" w:cs="Arial"/>
               </w:rPr>
-              <w:t>Abbiamo discusso per il terzo sprint</w:t>
+              <w:t>N/D</w:t>
             </w:r>
           </w:p>
         </w:tc>
@@ -2314,7 +2563,7 @@
               <w:rPr>
                 <w:rFonts w:ascii="Arial" w:hAnsi="Arial" w:cs="Arial"/>
               </w:rPr>
-              <w:t>N/D</w:t>
+              <w:t>Abbiamo discusso su come ci siamo organizzati questo Sprint e siamo arrivati alla conclusione che dovremmo un attimo migliorare il tempismo</w:t>
             </w:r>
           </w:p>
         </w:tc>
@@ -5877,6 +6126,7 @@
     <w:rsid w:val="000B454E"/>
     <w:rsid w:val="000B47BC"/>
     <w:rsid w:val="000E0CC5"/>
+    <w:rsid w:val="000E1EED"/>
     <w:rsid w:val="000F117C"/>
     <w:rsid w:val="001101C0"/>
     <w:rsid w:val="00127196"/>
@@ -5970,6 +6220,7 @@
     <w:rsid w:val="00BD119E"/>
     <w:rsid w:val="00C22A10"/>
     <w:rsid w:val="00C57AC2"/>
+    <w:rsid w:val="00C63242"/>
     <w:rsid w:val="00CA6ECA"/>
     <w:rsid w:val="00CB349C"/>
     <w:rsid w:val="00CC5E51"/>

</xml_diff>